<commit_message>
Actualiza introduccion y cierre CPS segun revision 4
</commit_message>
<xml_diff>
--- a/templates/asistencia_tecnica/MODELO_DE_RESPUESTA_CPS.docx
+++ b/templates/asistencia_tecnica/MODELO_DE_RESPUESTA_CPS.docx
@@ -909,29 +909,7 @@
           <w:szCs w:val="22"/>
           <w:lang w:val="es-CO" w:eastAsia="ar-SA"/>
         </w:rPr>
-        <w:t xml:space="preserve">La Dirección para la Gestión del Desarrollo Local en cumplimiento con lo dispuesto en la Constitución Política, la Ley 80 de 1993, la Ley 1150 de 2007 en sus artículos 2, 3, y 4 y sus decretos reglamentarios, el artículo 13 del Decreto 411 de 2016, </w:t>
-      </w:r>
-      <w:r>
-        <w:rPr>
-          <w:rFonts w:ascii="Garamond" w:hAnsi="Garamond" w:cs="Arial"/>
-          <w:iCs/>
-          <w:color w:val="000000"/>
-          <w:sz w:val="22"/>
-          <w:szCs w:val="22"/>
-          <w:lang w:val="es-CO" w:eastAsia="ar-SA"/>
-        </w:rPr>
-        <w:t>así como los principios de la función administrativa y lo establecido en el Acuerdo 740 de 2019 y su Decreto Reglamentario 768 de 2019, parcialmente adicionado y modificado por el Decreto 168 de 2021; procede a efectuar el análisis técnico y jurídico</w:t>
-      </w:r>
-      <w:r>
-        <w:rPr>
-          <w:rFonts w:ascii="Garamond" w:hAnsi="Garamond" w:cs="Arial"/>
-          <w:iCs/>
-          <w:color w:val="000000"/>
-          <w:sz w:val="22"/>
-          <w:szCs w:val="22"/>
-          <w:lang w:val="es-CO" w:eastAsia="ar-SA"/>
-        </w:rPr>
-        <w:t xml:space="preserve"> de las siguientes solicitudes de modificación contractual:</w:t>
+        <w:t xml:space="preserve">La Dirección para la Gestión del Desarrollo Local (DGDL) en cumplimiento con lo dispuesto en la Constitución Política, la Ley 80 de 1993, la Ley 1150 de 2007 en sus artículos 2, 3, y 4 y sus decretos reglamentarios, el artículo 15 del Decreto Distrital 642 de 2025, así como los principios de la función administrativa y lo establecido en el Acuerdo 740 de 2019 (reglamentado en los artículos 147 a 160 del Decreto Distrital 642 de 2025); realiza el análisis técnico y jurídico de las siguientes solicitudes de modificación contractual a contratos de prestación de servicios profesionales y de apoyo a la gestión:</w:t>
       </w:r>
     </w:p>
     <w:p>
@@ -6307,214 +6285,17 @@
     <w:p>
       <w:pPr>
         <w:pStyle w:val="Encabezado"/>
-        <w:numPr>
-          <w:ilvl w:val="0"/>
-          <w:numId w:val="20"/>
-        </w:numPr>
-        <w:ind w:left="426" w:hanging="426"/>
         <w:contextualSpacing/>
         <w:jc w:val="both"/>
         <w:rPr>
           <w:rFonts w:ascii="Garamond" w:hAnsi="Garamond" w:cs="Arial"/>
-          <w:bCs/>
+          <w:b/>
           <w:sz w:val="22"/>
           <w:szCs w:val="22"/>
           <w:u w:val="single"/>
-        </w:rPr>
-      </w:pPr>
-      <w:r>
-        <w:rPr>
-          <w:rFonts w:ascii="Garamond" w:hAnsi="Garamond" w:cs="Arial"/>
-          <w:bCs/>
-          <w:sz w:val="22"/>
-          <w:szCs w:val="22"/>
-          <w:u w:val="single"/>
-        </w:rPr>
-        <w:t xml:space="preserve">Tenga en cuenta </w:t>
-      </w:r>
-      <w:r>
-        <w:rPr>
-          <w:rFonts w:ascii="Garamond" w:hAnsi="Garamond" w:cs="Arial"/>
-          <w:bCs/>
-          <w:sz w:val="22"/>
-          <w:szCs w:val="22"/>
-          <w:u w:val="single"/>
-        </w:rPr>
-        <w:t xml:space="preserve">lo dispuesto en la </w:t>
-      </w:r>
-      <w:r>
-        <w:rPr>
-          <w:rFonts w:ascii="Garamond" w:hAnsi="Garamond" w:cs="Arial"/>
-          <w:bCs/>
-          <w:sz w:val="22"/>
-          <w:szCs w:val="22"/>
-          <w:u w:val="single"/>
-        </w:rPr>
-        <w:t>Directiva Conjunta No. 01 de 2025</w:t>
-      </w:r>
-      <w:r>
-        <w:rPr>
-          <w:rFonts w:ascii="Garamond" w:hAnsi="Garamond" w:cs="Arial"/>
-          <w:bCs/>
-          <w:sz w:val="22"/>
-          <w:szCs w:val="22"/>
-          <w:u w:val="single"/>
-        </w:rPr>
-        <w:t xml:space="preserve"> “</w:t>
-      </w:r>
-      <w:r>
-        <w:rPr>
-          <w:rFonts w:ascii="Garamond" w:hAnsi="Garamond" w:cs="Arial"/>
-          <w:bCs/>
-          <w:i/>
-          <w:iCs/>
-          <w:sz w:val="22"/>
-          <w:szCs w:val="22"/>
-          <w:u w:val="single"/>
-        </w:rPr>
-        <w:t>Lineamientos generales sobre restricciones y prohibiciones de las Leyes 996 de 2005 y 1952 de 2019, con ocasión del proceso electoral para Congreso, Presidente y Vicepresidente de la Republica previsto para el año 2026</w:t>
-      </w:r>
-      <w:r>
-        <w:rPr>
-          <w:rFonts w:ascii="Garamond" w:hAnsi="Garamond" w:cs="Arial"/>
-          <w:bCs/>
-          <w:sz w:val="22"/>
-          <w:szCs w:val="22"/>
-          <w:u w:val="single"/>
-        </w:rPr>
-        <w:t>”</w:t>
-      </w:r>
-      <w:r>
-        <w:rPr>
-          <w:rFonts w:ascii="Garamond" w:hAnsi="Garamond" w:cs="Arial"/>
-          <w:bCs/>
-          <w:sz w:val="22"/>
-          <w:szCs w:val="22"/>
-          <w:u w:val="single"/>
-        </w:rPr>
-        <w:t xml:space="preserve"> en especial</w:t>
-      </w:r>
-      <w:r>
-        <w:rPr>
-          <w:rFonts w:ascii="Garamond" w:hAnsi="Garamond" w:cs="Arial"/>
-          <w:bCs/>
-          <w:sz w:val="22"/>
-          <w:szCs w:val="22"/>
-          <w:u w:val="single"/>
-        </w:rPr>
-        <w:t xml:space="preserve"> atención,</w:t>
-      </w:r>
-      <w:r>
-        <w:rPr>
-          <w:rFonts w:ascii="Garamond" w:hAnsi="Garamond" w:cs="Arial"/>
-          <w:bCs/>
-          <w:sz w:val="22"/>
-          <w:szCs w:val="22"/>
-          <w:u w:val="single"/>
-        </w:rPr>
-        <w:t xml:space="preserve"> </w:t>
-      </w:r>
-      <w:r>
-        <w:rPr>
-          <w:rFonts w:ascii="Garamond" w:hAnsi="Garamond" w:cs="Arial"/>
-          <w:bCs/>
-          <w:sz w:val="22"/>
-          <w:szCs w:val="22"/>
-          <w:u w:val="single"/>
-        </w:rPr>
-        <w:t>lo referente a</w:t>
-      </w:r>
-      <w:r>
-        <w:rPr>
-          <w:rFonts w:ascii="Garamond" w:hAnsi="Garamond" w:cs="Arial"/>
-          <w:bCs/>
-          <w:sz w:val="22"/>
-          <w:szCs w:val="22"/>
-          <w:u w:val="single"/>
-        </w:rPr>
-        <w:t xml:space="preserve"> los temas contractuales.</w:t>
-      </w:r>
-    </w:p>
-    <w:p>
-      <w:pPr>
-        <w:pStyle w:val="Encabezado"/>
-        <w:ind w:left="426"/>
-        <w:contextualSpacing/>
-        <w:jc w:val="both"/>
-        <w:rPr>
-          <w:rFonts w:ascii="Garamond" w:hAnsi="Garamond" w:cs="Arial"/>
-          <w:bCs/>
-          <w:sz w:val="22"/>
-          <w:szCs w:val="22"/>
-          <w:u w:val="single"/>
-        </w:rPr>
-      </w:pPr>
-    </w:p>
-    <w:p>
-      <w:pPr>
-        <w:pStyle w:val="Encabezado"/>
-        <w:numPr>
-          <w:ilvl w:val="0"/>
-          <w:numId w:val="20"/>
-        </w:numPr>
-        <w:ind w:left="426" w:hanging="426"/>
-        <w:contextualSpacing/>
-        <w:jc w:val="both"/>
-        <w:rPr>
-          <w:rFonts w:ascii="Garamond" w:hAnsi="Garamond" w:cs="Arial"/>
-          <w:b/>
-          <w:sz w:val="22"/>
-          <w:szCs w:val="22"/>
-          <w:u w:val="single"/>
-        </w:rPr>
-      </w:pPr>
-      <w:r>
-        <w:rPr>
-          <w:rFonts w:ascii="Garamond" w:hAnsi="Garamond" w:cs="Arial"/>
-          <w:bCs/>
-          <w:sz w:val="22"/>
-          <w:szCs w:val="22"/>
-        </w:rPr>
-        <w:t xml:space="preserve">Tener presente que </w:t>
-      </w:r>
-      <w:r>
-        <w:rPr>
-          <w:rFonts w:ascii="Garamond" w:hAnsi="Garamond" w:cs="Arial"/>
-          <w:bCs/>
-          <w:sz w:val="22"/>
-          <w:szCs w:val="22"/>
-        </w:rPr>
-        <w:t>con l</w:t>
-      </w:r>
-      <w:r>
-        <w:rPr>
-          <w:rFonts w:ascii="Garamond" w:hAnsi="Garamond" w:cs="Arial"/>
-          <w:bCs/>
-          <w:sz w:val="22"/>
-          <w:szCs w:val="22"/>
-        </w:rPr>
-        <w:t xml:space="preserve">a Resolución 467 de 2025 establece ajustes a la Planilla Integrada de Liquidación de Aportes (PILA) en relación con los contratos de prestación de servicios, en cumplimiento de la Ley 2381 de 2024. Señala que los contratantes deben afiliar a los contratistas al Sistema General de Riesgos Laborales cuando los contratos superen un mes y correspondan a actividades de riesgo clase IV o V. Además, </w:t>
-      </w:r>
-      <w:r>
-        <w:rPr>
-          <w:rFonts w:ascii="Garamond" w:hAnsi="Garamond" w:cs="Arial"/>
-          <w:b/>
-          <w:sz w:val="22"/>
-          <w:szCs w:val="22"/>
-          <w:u w:val="single"/>
-        </w:rPr>
-        <w:t>pueden voluntariamente asumir los aportes a salud, pensión y cajas de compensación familiar si así se acuerda con el contratista</w:t>
-      </w:r>
-      <w:r>
-        <w:rPr>
-          <w:rFonts w:ascii="Garamond" w:hAnsi="Garamond" w:cs="Arial"/>
-          <w:b/>
-          <w:sz w:val="22"/>
-          <w:szCs w:val="22"/>
-          <w:u w:val="single"/>
-        </w:rPr>
-        <w:t>.</w:t>
-      </w:r>
+          <w:lang w:val="es-CO"/>
+        </w:rPr>
+      </w:pPr>
     </w:p>
     <w:p>
       <w:pPr>
@@ -6530,6 +6311,17 @@
           <w:lang w:val="es-CO"/>
         </w:rPr>
       </w:pPr>
+      <w:r>
+        <w:rPr>
+          <w:rFonts w:ascii="Garamond" w:hAnsi="Garamond" w:cs="Arial"/>
+          <w:b/>
+          <w:sz w:val="22"/>
+          <w:szCs w:val="22"/>
+          <w:u w:val="single"/>
+          <w:lang w:val="es-CO"/>
+        </w:rPr>
+        <w:t>NOTA</w:t>
+      </w:r>
     </w:p>
     <w:p>
       <w:pPr>
@@ -6538,10 +6330,8 @@
         <w:jc w:val="both"/>
         <w:rPr>
           <w:rFonts w:ascii="Garamond" w:hAnsi="Garamond" w:cs="Arial"/>
-          <w:b/>
-          <w:sz w:val="22"/>
-          <w:szCs w:val="22"/>
-          <w:u w:val="single"/>
+          <w:sz w:val="22"/>
+          <w:szCs w:val="22"/>
           <w:lang w:val="es-CO"/>
         </w:rPr>
       </w:pPr>
@@ -6553,23 +6343,20 @@
         <w:jc w:val="both"/>
         <w:rPr>
           <w:rFonts w:ascii="Garamond" w:hAnsi="Garamond" w:cs="Arial"/>
-          <w:b/>
-          <w:sz w:val="22"/>
-          <w:szCs w:val="22"/>
-          <w:u w:val="single"/>
+          <w:bCs/>
+          <w:sz w:val="22"/>
+          <w:szCs w:val="22"/>
           <w:lang w:val="es-CO"/>
         </w:rPr>
       </w:pPr>
       <w:r>
         <w:rPr>
           <w:rFonts w:ascii="Garamond" w:hAnsi="Garamond" w:cs="Arial"/>
-          <w:b/>
-          <w:sz w:val="22"/>
-          <w:szCs w:val="22"/>
-          <w:u w:val="single"/>
+          <w:sz w:val="22"/>
+          <w:szCs w:val="22"/>
           <w:lang w:val="es-CO"/>
         </w:rPr>
-        <w:t>NOTA</w:t>
+        <w:t xml:space="preserve">Importante resaltar que la Dirección para la Gestión del Desarrollo Local a través del radicado 20262100323333 del 31 de agosto de 2026, emitió “RECOMENDACIONES, SUGERENCIAS Y ALERTAS TEMPRANAS SEGUNDO SEMESTRE VIGENCIA 2026” con la finalidad de dar seguridad jurídica a los procesos de contratación, especialmente en lo referente a la asistencia técnica para modificaciones contractuales y el cumplimiento de términos procedimentales, siendo su contenido indispensable para asegurar una ejecución eficiente y transparente, proporcionando a los equipos locales las herramientas preventivas y los lineamientos operativos requeridos para optimizar la gestión administrativa y mitigar riesgos institucionales.</w:t>
       </w:r>
     </w:p>
     <w:p>
@@ -6579,6 +6366,7 @@
         <w:jc w:val="both"/>
         <w:rPr>
           <w:rFonts w:ascii="Garamond" w:hAnsi="Garamond" w:cs="Arial"/>
+          <w:i/>
           <w:sz w:val="22"/>
           <w:szCs w:val="22"/>
           <w:lang w:val="es-CO"/>
@@ -6592,10 +6380,11 @@
         <w:jc w:val="both"/>
         <w:rPr>
           <w:rFonts w:ascii="Garamond" w:hAnsi="Garamond" w:cs="Arial"/>
-          <w:bCs/>
           <w:sz w:val="22"/>
           <w:szCs w:val="22"/>
           <w:lang w:val="es-CO"/>
+          <w:i w:val="0"/>
+          <w:iCs w:val="0"/>
         </w:rPr>
       </w:pPr>
       <w:r>
@@ -6604,147 +6393,10 @@
           <w:sz w:val="22"/>
           <w:szCs w:val="22"/>
           <w:lang w:val="es-CO"/>
-        </w:rPr>
-        <w:t>La Dirección para la Gestión del Desarrollo Local mediante memorando de radicado</w:t>
-      </w:r>
-      <w:r>
-        <w:rPr>
-          <w:rFonts w:ascii="Garamond" w:hAnsi="Garamond" w:cs="Arial"/>
-          <w:sz w:val="22"/>
-          <w:szCs w:val="22"/>
-          <w:lang w:val="es-CO"/>
-        </w:rPr>
-        <w:t xml:space="preserve"> </w:t>
-      </w:r>
-      <w:r>
-        <w:rPr>
-          <w:rFonts w:ascii="Garamond" w:hAnsi="Garamond" w:cs="Arial"/>
-          <w:sz w:val="22"/>
-          <w:szCs w:val="22"/>
-          <w:highlight w:val="yellow"/>
-          <w:lang w:val="es-CO"/>
-        </w:rPr>
-        <w:t>XXXXXXXX</w:t>
-      </w:r>
-      <w:r>
-        <w:rPr>
-          <w:rFonts w:ascii="Garamond" w:hAnsi="Garamond" w:cs="Arial"/>
-          <w:b/>
-          <w:sz w:val="22"/>
-          <w:szCs w:val="22"/>
-          <w:highlight w:val="yellow"/>
-          <w:lang w:val="es-CO"/>
-        </w:rPr>
-        <w:t xml:space="preserve"> </w:t>
-      </w:r>
-      <w:r>
-        <w:rPr>
-          <w:rFonts w:ascii="Garamond" w:hAnsi="Garamond" w:cs="Arial"/>
-          <w:sz w:val="22"/>
-          <w:szCs w:val="22"/>
-          <w:highlight w:val="yellow"/>
-          <w:lang w:val="es-CO"/>
-        </w:rPr>
-        <w:t>del 3</w:t>
-      </w:r>
-      <w:r>
-        <w:rPr>
-          <w:rFonts w:ascii="Garamond" w:hAnsi="Garamond" w:cs="Arial"/>
-          <w:sz w:val="22"/>
-          <w:szCs w:val="22"/>
-          <w:highlight w:val="yellow"/>
-          <w:lang w:val="es-CO"/>
-        </w:rPr>
-        <w:t>1</w:t>
-      </w:r>
-      <w:r>
-        <w:rPr>
-          <w:rFonts w:ascii="Garamond" w:hAnsi="Garamond" w:cs="Arial"/>
-          <w:sz w:val="22"/>
-          <w:szCs w:val="22"/>
-          <w:highlight w:val="yellow"/>
-          <w:lang w:val="es-CO"/>
-        </w:rPr>
-        <w:t xml:space="preserve"> de</w:t>
-      </w:r>
-      <w:r>
-        <w:rPr>
-          <w:rFonts w:ascii="Garamond" w:hAnsi="Garamond" w:cs="Arial"/>
-          <w:sz w:val="22"/>
-          <w:szCs w:val="22"/>
-          <w:highlight w:val="yellow"/>
-          <w:lang w:val="es-CO"/>
-        </w:rPr>
-        <w:t xml:space="preserve"> julio </w:t>
-      </w:r>
-      <w:r>
-        <w:rPr>
-          <w:rFonts w:ascii="Garamond" w:hAnsi="Garamond" w:cs="Arial"/>
-          <w:sz w:val="22"/>
-          <w:szCs w:val="22"/>
-          <w:highlight w:val="yellow"/>
-          <w:lang w:val="es-CO"/>
-        </w:rPr>
-        <w:t>de 202</w:t>
-      </w:r>
-      <w:r>
-        <w:rPr>
-          <w:rFonts w:ascii="Garamond" w:hAnsi="Garamond" w:cs="Arial"/>
-          <w:sz w:val="22"/>
-          <w:szCs w:val="22"/>
-          <w:highlight w:val="yellow"/>
-          <w:lang w:val="es-CO"/>
-        </w:rPr>
-        <w:t>5</w:t>
-      </w:r>
-      <w:r>
-        <w:rPr>
-          <w:rFonts w:ascii="Garamond" w:hAnsi="Garamond" w:cs="Arial"/>
-          <w:sz w:val="22"/>
-          <w:szCs w:val="22"/>
-          <w:lang w:val="es-CO"/>
-        </w:rPr>
-        <w:t>,</w:t>
-      </w:r>
-      <w:r>
-        <w:rPr>
-          <w:rFonts w:ascii="Garamond" w:hAnsi="Garamond" w:cs="Arial"/>
-          <w:sz w:val="22"/>
-          <w:szCs w:val="22"/>
-          <w:lang w:val="es-CO"/>
-        </w:rPr>
-        <w:t xml:space="preserve"> emitió </w:t>
-      </w:r>
-      <w:r>
-        <w:rPr>
-          <w:rFonts w:ascii="Garamond" w:hAnsi="Garamond" w:cs="Arial"/>
-          <w:i/>
-          <w:sz w:val="22"/>
-          <w:szCs w:val="22"/>
-          <w:lang w:val="es-CO"/>
-        </w:rPr>
-        <w:t>“</w:t>
-      </w:r>
-      <w:r>
-        <w:rPr>
-          <w:rFonts w:ascii="Garamond" w:hAnsi="Garamond" w:cs="Arial"/>
-          <w:bCs/>
-          <w:i/>
-          <w:sz w:val="22"/>
-          <w:szCs w:val="22"/>
-          <w:lang w:val="es-CO"/>
-        </w:rPr>
-        <w:t xml:space="preserve">RECOMENDACIONES, SUGERENCIAS Y ALERTAS TEMPRANAS” </w:t>
-      </w:r>
-      <w:r>
-        <w:rPr>
-          <w:rFonts w:ascii="Garamond" w:hAnsi="Garamond" w:cs="Arial"/>
-          <w:bCs/>
-          <w:sz w:val="22"/>
-          <w:szCs w:val="22"/>
-          <w:lang w:val="es-CO"/>
-        </w:rPr>
-        <w:t>en la cual se indica que:</w:t>
+          <w:i w:val="0"/>
+          <w:iCs w:val="0"/>
+        </w:rPr>
+        <w:t xml:space="preserve">El Fondo de Desarrollo Local tiene el deber de analizar, gestionar y definir la continuidad de los contratos prestación de servicios profesionales y de apoyo a la gestión, acorde a la facultad delegada por el artículo 654 del Decreto 642 de 2025 y en razón a la responsabilidad del mandatario local como representante legal del Fondo de Desarrollo Local, siendo facultativo acoger o no acoger, parcial o total, lo expuesto en este documento.</w:t>
       </w:r>
     </w:p>
     <w:p>
@@ -6754,7 +6406,6 @@
         <w:jc w:val="both"/>
         <w:rPr>
           <w:rFonts w:ascii="Garamond" w:hAnsi="Garamond" w:cs="Arial"/>
-          <w:i/>
           <w:sz w:val="22"/>
           <w:szCs w:val="22"/>
           <w:lang w:val="es-CO"/>
@@ -6768,7 +6419,6 @@
         <w:jc w:val="both"/>
         <w:rPr>
           <w:rFonts w:ascii="Garamond" w:hAnsi="Garamond" w:cs="Arial"/>
-          <w:i/>
           <w:sz w:val="22"/>
           <w:szCs w:val="22"/>
           <w:lang w:val="es-CO"/>
@@ -6777,105 +6427,11 @@
       <w:r>
         <w:rPr>
           <w:rFonts w:ascii="Garamond" w:hAnsi="Garamond" w:cs="Arial"/>
-          <w:i/>
           <w:sz w:val="22"/>
           <w:szCs w:val="22"/>
           <w:lang w:val="es-CO"/>
         </w:rPr>
-        <w:t xml:space="preserve"> </w:t>
-      </w:r>
-      <w:r>
-        <w:rPr>
-          <w:rFonts w:ascii="Garamond" w:hAnsi="Garamond" w:cs="Arial"/>
-          <w:i/>
-          <w:sz w:val="22"/>
-          <w:szCs w:val="22"/>
-          <w:lang w:val="es-CO"/>
-        </w:rPr>
-        <w:t xml:space="preserve">“La Dirección para la Gestión del Desarrollo Local DGDL de la Secretaría Distrital de Gobierno emitirá una única respuesta de Asistencia Técnica, dentro del término de quince (15) días hábiles siguientes a la radicación por parte del FDL, de conformidad con las competencias asignadas en el Decreto Distrital 411 de 2016, respuesta de Asistencia Técnica que no debe confundirse con un concepto o viabilidad / favorabilidad contractual, por el contrario, se presenta como un documento contentivo de recomendaciones, </w:t>
-      </w:r>
-      <w:r>
-        <w:rPr>
-          <w:rFonts w:ascii="Garamond" w:hAnsi="Garamond" w:cs="Arial"/>
-          <w:i/>
-          <w:sz w:val="22"/>
-          <w:szCs w:val="22"/>
-          <w:lang w:val="es-CO"/>
-        </w:rPr>
-        <w:lastRenderedPageBreak/>
-        <w:t>sugerencias y observaciones que valdría el esfuerzo tuviera en cuenta el FDL de manera previa al adelantamiento de sus pretensiones contractuales, así como para el fortalecimiento en la toma de sus decisiones</w:t>
-      </w:r>
-      <w:r>
-        <w:rPr>
-          <w:rFonts w:ascii="Garamond" w:hAnsi="Garamond" w:cs="Arial"/>
-          <w:sz w:val="22"/>
-          <w:szCs w:val="22"/>
-          <w:lang w:val="es-CO"/>
-        </w:rPr>
-        <w:t>.</w:t>
-      </w:r>
-      <w:r>
-        <w:rPr>
-          <w:rFonts w:ascii="Garamond" w:hAnsi="Garamond" w:cs="Arial"/>
-          <w:i/>
-          <w:sz w:val="22"/>
-          <w:szCs w:val="22"/>
-          <w:lang w:val="es-CO"/>
-        </w:rPr>
-        <w:t>”</w:t>
-      </w:r>
-    </w:p>
-    <w:p>
-      <w:pPr>
-        <w:pStyle w:val="Encabezado"/>
-        <w:contextualSpacing/>
-        <w:jc w:val="both"/>
-        <w:rPr>
-          <w:rFonts w:ascii="Garamond" w:hAnsi="Garamond" w:cs="Arial"/>
-          <w:sz w:val="22"/>
-          <w:szCs w:val="22"/>
-          <w:lang w:val="es-CO"/>
-        </w:rPr>
-      </w:pPr>
-    </w:p>
-    <w:p>
-      <w:pPr>
-        <w:pStyle w:val="Encabezado"/>
-        <w:contextualSpacing/>
-        <w:jc w:val="both"/>
-        <w:rPr>
-          <w:rFonts w:ascii="Garamond" w:hAnsi="Garamond" w:cs="Arial"/>
-          <w:sz w:val="22"/>
-          <w:szCs w:val="22"/>
-          <w:lang w:val="es-CO"/>
-        </w:rPr>
-      </w:pPr>
-      <w:r>
-        <w:rPr>
-          <w:rFonts w:ascii="Garamond" w:hAnsi="Garamond" w:cs="Arial"/>
-          <w:sz w:val="22"/>
-          <w:szCs w:val="22"/>
-          <w:lang w:val="es-CO"/>
-        </w:rPr>
-        <w:t xml:space="preserve">Por lo que el Fondo de Desarrollo Local tiene el deber de analizar, gestionar y definir la continuidad de los </w:t>
-      </w:r>
-      <w:r>
-        <w:rPr>
-          <w:rFonts w:ascii="Garamond" w:hAnsi="Garamond" w:cs="Arial"/>
-          <w:bCs/>
-          <w:sz w:val="22"/>
-          <w:szCs w:val="22"/>
-        </w:rPr>
-        <w:t xml:space="preserve">contratos prestación de servicios profesionales y de apoyo a la gestión, en razón a la </w:t>
-      </w:r>
-      <w:r>
-        <w:rPr>
-          <w:rFonts w:ascii="Garamond" w:hAnsi="Garamond" w:cs="Arial"/>
-          <w:sz w:val="22"/>
-          <w:szCs w:val="22"/>
-          <w:lang w:val="es-CO"/>
-        </w:rPr>
-        <w:t>responsabilidad del mandatario local como representante legal del Fondo de Desarrollo Local, siendo facultativo acoger o no acoger, parcial o total, lo expuesto en este documento.</w:t>
+        <w:t xml:space="preserve">A través de este análisis, fortalecemos el acompañamiento a la gestión local en la búsqueda de la mejora continua, siendo consecuentes en que cada modificación propuesta responda a una necesidad real y sustentada del servicio, contribuyendo así a una administración más eficiente y responsable frente a los retos de la actual vigencia.</w:t>
       </w:r>
     </w:p>
     <w:p>

</xml_diff>